<commit_message>
Passe de qualidade completo por partido/ano — 11920 promessas
- IL leg_2022: 25 cabeçalhos 'Base X' + 8 textos explicativos invalidados; page numbers removidos
- PAN leg_2025: 26 truncados 'A ÚTIL PARA O FUTURO' invalidados; 30 corrigidos
- PSD leg_2025 + PCP leg_2025: 110 promessas com ':;' (header+acção) corrigidas
- PS leg_2022 + PAN leg_2022: page numbers no final removidos
- BE leg_2022: textos garbled invalidados
- PCP leg_2025: 8 frases retóricas/vagas invalidadas
- PCP leg_2024: 8 promessas recuperadas de bullets embedidos
- FTS5 reconstruído
- Total: 12015 -> 11920 (-95)
</commit_message>
<xml_diff>
--- a/descricao_sumaria.docx
+++ b/descricao_sumaria.docx
@@ -224,7 +224,7 @@
           <w:sz w:val="22"/>
           <w:szCs w:val="22"/>
         </w:rPr>
-        <w:t xml:space="preserve">12 015 promessas</w:t>
+        <w:t xml:space="preserve">11 920 promessas</w:t>
       </w:r>
       <w:r>
         <w:rPr>
@@ -619,7 +619,7 @@
                 <w:sz w:val="20"/>
                 <w:szCs w:val="20"/>
               </w:rPr>
-              <w:t xml:space="preserve">2 785</w:t>
+              <w:t xml:space="preserve">2 783</w:t>
             </w:r>
           </w:p>
         </w:tc>
@@ -683,7 +683,7 @@
                 <w:sz w:val="20"/>
                 <w:szCs w:val="20"/>
               </w:rPr>
-              <w:t xml:space="preserve">2 322</w:t>
+              <w:t xml:space="preserve">2 296</w:t>
             </w:r>
           </w:p>
         </w:tc>
@@ -747,7 +747,7 @@
                 <w:sz w:val="20"/>
                 <w:szCs w:val="20"/>
               </w:rPr>
-              <w:t xml:space="preserve">1 331</w:t>
+              <w:t xml:space="preserve">1 330</w:t>
             </w:r>
           </w:p>
         </w:tc>
@@ -811,7 +811,7 @@
                 <w:sz w:val="20"/>
                 <w:szCs w:val="20"/>
               </w:rPr>
-              <w:t xml:space="preserve">1 314</w:t>
+              <w:t xml:space="preserve">1 306</w:t>
             </w:r>
           </w:p>
         </w:tc>
@@ -875,7 +875,7 @@
                 <w:sz w:val="20"/>
                 <w:szCs w:val="20"/>
               </w:rPr>
-              <w:t xml:space="preserve">1 302</w:t>
+              <w:t xml:space="preserve">1 292</w:t>
             </w:r>
           </w:p>
         </w:tc>
@@ -939,7 +939,7 @@
                 <w:sz w:val="20"/>
                 <w:szCs w:val="20"/>
               </w:rPr>
-              <w:t xml:space="preserve">1 085</w:t>
+              <w:t xml:space="preserve">1 037</w:t>
             </w:r>
           </w:p>
         </w:tc>
@@ -1195,7 +1195,7 @@
                 <w:sz w:val="20"/>
                 <w:szCs w:val="20"/>
               </w:rPr>
-              <w:t xml:space="preserve">12 015</w:t>
+              <w:t xml:space="preserve">11 920</w:t>
             </w:r>
           </w:p>
         </w:tc>

</xml_diff>

<commit_message>
Chega leg_2025: 50 invalidated (garbled OCR) + 277 text corrections
</commit_message>
<xml_diff>
--- a/descricao_sumaria.docx
+++ b/descricao_sumaria.docx
@@ -224,7 +224,7 @@
           <w:sz w:val="22"/>
           <w:szCs w:val="22"/>
         </w:rPr>
-        <w:t xml:space="preserve">11 920 promessas</w:t>
+        <w:t xml:space="preserve">11 872 promessas</w:t>
       </w:r>
       <w:r>
         <w:rPr>
@@ -811,7 +811,7 @@
                 <w:sz w:val="20"/>
                 <w:szCs w:val="20"/>
               </w:rPr>
-              <w:t xml:space="preserve">1 306</w:t>
+              <w:t xml:space="preserve">1 258</w:t>
             </w:r>
           </w:p>
         </w:tc>
@@ -1195,7 +1195,7 @@
                 <w:sz w:val="20"/>
                 <w:szCs w:val="20"/>
               </w:rPr>
-              <w:t xml:space="preserve">11 920</w:t>
+              <w:t xml:space="preserve">11 872</w:t>
             </w:r>
           </w:p>
         </w:tc>

</xml_diff>